<commit_message>
Began incorporating subscription logic (actual management of subscriptions using RevenueCat SDK not yet included). Minor aesthetic changes to app and generated reports
</commit_message>
<xml_diff>
--- a/backend/template.docx
+++ b/backend/template.docx
@@ -4,7 +4,8 @@
   <w:body>
     <w:p/>
     <w:sectPr>
-      <w:footerReference w:type="default" r:id="rId7"/>
+      <w:headerReference w:type="default" r:id="rId7"/>
+      <w:footerReference w:type="default" r:id="rId8"/>
       <w:pgSz w:w="11906" w:h="16838"/>
       <w:pgMar w:top="1440" w:right="1440" w:bottom="1440" w:left="1440" w:header="708" w:footer="708" w:gutter="0"/>
       <w:cols w:space="708"/>
@@ -207,7 +208,7 @@
       <mc:AlternateContent>
         <mc:Choice Requires="wps">
           <w:drawing>
-            <wp:anchor distT="0" distB="0" distL="114300" distR="114300" simplePos="0" relativeHeight="251659264" behindDoc="0" locked="0" layoutInCell="1" allowOverlap="1" wp14:anchorId="09EA008E" wp14:editId="684A2A76">
+            <wp:anchor distT="0" distB="0" distL="114300" distR="114300" simplePos="0" relativeHeight="251659264" behindDoc="0" locked="0" layoutInCell="1" allowOverlap="1" wp14:anchorId="09EA008E" wp14:editId="3EFD818A">
               <wp:simplePos x="0" y="0"/>
               <wp:positionH relativeFrom="margin">
                 <wp:align>right</wp:align>
@@ -216,7 +217,7 @@
                 <wp:posOffset>154214</wp:posOffset>
               </wp:positionV>
               <wp:extent cx="5736771" cy="0"/>
-              <wp:effectExtent l="0" t="0" r="0" b="0"/>
+              <wp:effectExtent l="0" t="0" r="16510" b="12700"/>
               <wp:wrapNone/>
               <wp:docPr id="1149344850" name="Straight Connector 3"/>
               <wp:cNvGraphicFramePr/>
@@ -232,9 +233,9 @@
                       <a:prstGeom prst="line">
                         <a:avLst/>
                       </a:prstGeom>
-                      <a:ln w="19050">
+                      <a:ln w="12700">
                         <a:solidFill>
-                          <a:srgbClr val="248E6B"/>
+                          <a:srgbClr val="0E533C"/>
                         </a:solidFill>
                       </a:ln>
                     </wps:spPr>
@@ -267,7 +268,7 @@
         </mc:Choice>
         <mc:Fallback>
           <w:pict>
-            <v:line w14:anchorId="55A08D46" id="Straight Connector 3" o:spid="_x0000_s1026" style="position:absolute;flip:x;z-index:251659264;visibility:visible;mso-wrap-style:square;mso-width-percent:0;mso-height-percent:0;mso-wrap-distance-left:9pt;mso-wrap-distance-top:0;mso-wrap-distance-right:9pt;mso-wrap-distance-bottom:0;mso-position-horizontal:right;mso-position-horizontal-relative:margin;mso-position-vertical:absolute;mso-position-vertical-relative:text;mso-width-percent:0;mso-height-percent:0;mso-width-relative:margin;mso-height-relative:margin" from="400.5pt,12.15pt" to="852.2pt,12.15pt" o:gfxdata="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" strokecolor="#248e6b" strokeweight="1.5pt">
+            <v:line w14:anchorId="1F5C6BF1" id="Straight Connector 3" o:spid="_x0000_s1026" style="position:absolute;flip:x;z-index:251659264;visibility:visible;mso-wrap-style:square;mso-width-percent:0;mso-height-percent:0;mso-wrap-distance-left:9pt;mso-wrap-distance-top:0;mso-wrap-distance-right:9pt;mso-wrap-distance-bottom:0;mso-position-horizontal:right;mso-position-horizontal-relative:margin;mso-position-vertical:absolute;mso-position-vertical-relative:text;mso-width-percent:0;mso-height-percent:0;mso-width-relative:margin;mso-height-relative:margin" from="400.5pt,12.15pt" to="852.2pt,12.15pt" o:gfxdata="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" strokecolor="#0e533c" strokeweight="1pt">
               <v:stroke joinstyle="miter"/>
               <w10:wrap anchorx="margin"/>
             </v:line>
@@ -302,6 +303,76 @@
     </w:p>
   </w:footnote>
 </w:footnotes>
+</file>
+
+<file path=word/header1.xml><?xml version="1.0" encoding="utf-8"?>
+<w:hdr xmlns:wpc="http://schemas.microsoft.com/office/word/2010/wordprocessingCanvas" xmlns:cx="http://schemas.microsoft.com/office/drawing/2014/chartex" xmlns:cx1="http://schemas.microsoft.com/office/drawing/2015/9/8/chartex" xmlns:cx2="http://schemas.microsoft.com/office/drawing/2015/10/21/chartex" xmlns:cx3="http://schemas.microsoft.com/office/drawing/2016/5/9/chartex" xmlns:cx4="http://schemas.microsoft.com/office/drawing/2016/5/10/chartex" xmlns:cx5="http://schemas.microsoft.com/office/drawing/2016/5/11/chartex" xmlns:cx6="http://schemas.microsoft.com/office/drawing/2016/5/12/chartex" xmlns:cx7="http://schemas.microsoft.com/office/drawing/2016/5/13/chartex" xmlns:cx8="http://schemas.microsoft.com/office/drawing/2016/5/14/chartex" xmlns:mc="http://schemas.openxmlformats.org/markup-compatibility/2006" xmlns:aink="http://schemas.microsoft.com/office/drawing/2016/ink" xmlns:am3d="http://schemas.microsoft.com/office/drawing/2017/model3d" xmlns:o="urn:schemas-microsoft-com:office:office" xmlns:oel="http://schemas.microsoft.com/office/2019/extlst" xmlns:r="http://schemas.openxmlformats.org/officeDocument/2006/relationships" xmlns:m="http://schemas.openxmlformats.org/officeDocument/2006/math" xmlns:v="urn:schemas-microsoft-com:vml" xmlns:wp14="http://schemas.microsoft.com/office/word/2010/wordprocessingDrawing" xmlns:wp="http://schemas.openxmlformats.org/drawingml/2006/wordprocessingDrawing" xmlns:w10="urn:schemas-microsoft-com:office:word" xmlns:w="http://schemas.openxmlformats.org/wordprocessingml/2006/main" xmlns:w14="http://schemas.microsoft.com/office/word/2010/wordml" xmlns:w15="http://schemas.microsoft.com/office/word/2012/wordml" xmlns:w16cex="http://schemas.microsoft.com/office/word/2018/wordml/cex" xmlns:w16cid="http://schemas.microsoft.com/office/word/2016/wordml/cid" xmlns:w16="http://schemas.microsoft.com/office/word/2018/wordml" xmlns:w16du="http://schemas.microsoft.com/office/word/2023/wordml/word16du" xmlns:w16sdtdh="http://schemas.microsoft.com/office/word/2020/wordml/sdtdatahash" xmlns:w16sdtfl="http://schemas.microsoft.com/office/word/2024/wordml/sdtformatlock" xmlns:w16se="http://schemas.microsoft.com/office/word/2015/wordml/symex" xmlns:wpg="http://schemas.microsoft.com/office/word/2010/wordprocessingGroup" xmlns:wpi="http://schemas.microsoft.com/office/word/2010/wordprocessingInk" xmlns:wne="http://schemas.microsoft.com/office/word/2006/wordml" xmlns:wps="http://schemas.microsoft.com/office/word/2010/wordprocessingShape" mc:Ignorable="w14 w15 w16se w16cid w16 w16cex w16sdtdh w16sdtfl w16du wp14">
+  <w:p>
+    <w:pPr>
+      <w:pStyle w:val="Header"/>
+    </w:pPr>
+    <w:r>
+      <w:rPr>
+        <w:noProof/>
+      </w:rPr>
+      <w:drawing>
+        <wp:anchor distT="0" distB="0" distL="114300" distR="114300" simplePos="0" relativeHeight="251660288" behindDoc="1" locked="0" layoutInCell="1" allowOverlap="1" wp14:anchorId="446A6201" wp14:editId="4FB6FABE">
+          <wp:simplePos x="0" y="0"/>
+          <wp:positionH relativeFrom="column">
+            <wp:posOffset>4323644</wp:posOffset>
+          </wp:positionH>
+          <wp:positionV relativeFrom="paragraph">
+            <wp:posOffset>-280247</wp:posOffset>
+          </wp:positionV>
+          <wp:extent cx="1473200" cy="609600"/>
+          <wp:effectExtent l="0" t="0" r="0" b="0"/>
+          <wp:wrapNone/>
+          <wp:docPr id="734402068" name="Graphic 2"/>
+          <wp:cNvGraphicFramePr>
+            <a:graphicFrameLocks xmlns:a="http://schemas.openxmlformats.org/drawingml/2006/main" noChangeAspect="1"/>
+          </wp:cNvGraphicFramePr>
+          <a:graphic xmlns:a="http://schemas.openxmlformats.org/drawingml/2006/main">
+            <a:graphicData uri="http://schemas.openxmlformats.org/drawingml/2006/picture">
+              <pic:pic xmlns:pic="http://schemas.openxmlformats.org/drawingml/2006/picture">
+                <pic:nvPicPr>
+                  <pic:cNvPr id="734402068" name="Graphic 2"/>
+                  <pic:cNvPicPr/>
+                </pic:nvPicPr>
+                <pic:blipFill>
+                  <a:blip r:embed="rId1">
+                    <a:extLst>
+                      <a:ext uri="{96DAC541-7B7A-43D3-8B79-37D633B846F1}">
+                        <asvg:svgBlip xmlns:asvg="http://schemas.microsoft.com/office/drawing/2016/SVG/main" r:embed="rId2"/>
+                      </a:ext>
+                    </a:extLst>
+                  </a:blip>
+                  <a:stretch>
+                    <a:fillRect/>
+                  </a:stretch>
+                </pic:blipFill>
+                <pic:spPr>
+                  <a:xfrm>
+                    <a:off x="0" y="0"/>
+                    <a:ext cx="1473200" cy="609600"/>
+                  </a:xfrm>
+                  <a:prstGeom prst="rect">
+                    <a:avLst/>
+                  </a:prstGeom>
+                </pic:spPr>
+              </pic:pic>
+            </a:graphicData>
+          </a:graphic>
+          <wp14:sizeRelH relativeFrom="page">
+            <wp14:pctWidth>0</wp14:pctWidth>
+          </wp14:sizeRelH>
+          <wp14:sizeRelV relativeFrom="page">
+            <wp14:pctHeight>0</wp14:pctHeight>
+          </wp14:sizeRelV>
+        </wp:anchor>
+      </w:drawing>
+    </w:r>
+  </w:p>
+</w:hdr>
 </file>
 
 <file path=word/numbering.xml><?xml version="1.0" encoding="utf-8"?>
@@ -1337,7 +1408,7 @@
     <w:link w:val="SubtitleChar"/>
     <w:uiPriority w:val="11"/>
     <w:qFormat/>
-    <w:rsid w:val="007E7F69"/>
+    <w:rsid w:val="003E5AEB"/>
     <w:pPr>
       <w:numPr>
         <w:ilvl w:val="1"/>
@@ -1345,7 +1416,7 @@
     </w:pPr>
     <w:rPr>
       <w:rFonts w:ascii="Segoe UI Semibold" w:eastAsiaTheme="majorEastAsia" w:hAnsi="Segoe UI Semibold" w:cstheme="majorBidi"/>
-      <w:color w:val="248E6B"/>
+      <w:color w:val="0E533C"/>
       <w:spacing w:val="15"/>
       <w:sz w:val="28"/>
       <w:szCs w:val="28"/>
@@ -1356,10 +1427,10 @@
     <w:basedOn w:val="DefaultParagraphFont"/>
     <w:link w:val="Subtitle"/>
     <w:uiPriority w:val="11"/>
-    <w:rsid w:val="007E7F69"/>
+    <w:rsid w:val="003E5AEB"/>
     <w:rPr>
       <w:rFonts w:ascii="Segoe UI Semibold" w:eastAsiaTheme="majorEastAsia" w:hAnsi="Segoe UI Semibold" w:cstheme="majorBidi"/>
-      <w:color w:val="248E6B"/>
+      <w:color w:val="0E533C"/>
       <w:spacing w:val="15"/>
       <w:sz w:val="28"/>
       <w:szCs w:val="28"/>

</xml_diff>